<commit_message>
Publish Task 2 fundamental and technical analysis report
</commit_message>
<xml_diff>
--- a/task2-fundamental-technical-analysis/Fundamental_and_Technical_Analysis_Mahindra_Mahindra.docx
+++ b/task2-fundamental-technical-analysis/Fundamental_and_Technical_Analysis_Mahindra_Mahindra.docx
@@ -558,10 +558,202 @@
           </w:p>
         </w:tc>
       </w:tr>
+      <w:tr>
+        <w:tc>
+          <w:tcPr>
+            <w:tcW w:type="dxa" w:w="3408"/>
+          </w:tcPr>
+          <w:p>
+            <w:r>
+              <w:t>Total assets FY25</w:t>
+            </w:r>
+          </w:p>
+        </w:tc>
+        <w:tc>
+          <w:tcPr>
+            <w:tcW w:type="dxa" w:w="3408"/>
+          </w:tcPr>
+          <w:p>
+            <w:r>
+              <w:t>₹277,586.27 cr</w:t>
+            </w:r>
+          </w:p>
+        </w:tc>
+        <w:tc>
+          <w:tcPr>
+            <w:tcW w:type="dxa" w:w="3408"/>
+          </w:tcPr>
+          <w:p>
+            <w:r>
+              <w:t>Audited consolidated balance sheet at 31 March 2025</w:t>
+            </w:r>
+          </w:p>
+        </w:tc>
+      </w:tr>
+      <w:tr>
+        <w:tc>
+          <w:tcPr>
+            <w:tcW w:type="dxa" w:w="3408"/>
+          </w:tcPr>
+          <w:p>
+            <w:r>
+              <w:t>Total assets FY26</w:t>
+            </w:r>
+          </w:p>
+        </w:tc>
+        <w:tc>
+          <w:tcPr>
+            <w:tcW w:type="dxa" w:w="3408"/>
+          </w:tcPr>
+          <w:p>
+            <w:r>
+              <w:t>₹317,634.64 cr</w:t>
+            </w:r>
+          </w:p>
+        </w:tc>
+        <w:tc>
+          <w:tcPr>
+            <w:tcW w:type="dxa" w:w="3408"/>
+          </w:tcPr>
+          <w:p>
+            <w:r>
+              <w:t>Audited consolidated balance sheet at 31 March 2026</w:t>
+            </w:r>
+          </w:p>
+        </w:tc>
+      </w:tr>
+      <w:tr>
+        <w:tc>
+          <w:tcPr>
+            <w:tcW w:type="dxa" w:w="3408"/>
+          </w:tcPr>
+          <w:p>
+            <w:r>
+              <w:t>Total current assets / current liabilities FY25</w:t>
+            </w:r>
+          </w:p>
+        </w:tc>
+        <w:tc>
+          <w:tcPr>
+            <w:tcW w:type="dxa" w:w="3408"/>
+          </w:tcPr>
+          <w:p>
+            <w:r>
+              <w:t>1.40x</w:t>
+            </w:r>
+          </w:p>
+        </w:tc>
+        <w:tc>
+          <w:tcPr>
+            <w:tcW w:type="dxa" w:w="3408"/>
+          </w:tcPr>
+          <w:p>
+            <w:r>
+              <w:t>Current assets divided by current liabilities; group-wide indicator only</w:t>
+            </w:r>
+          </w:p>
+        </w:tc>
+      </w:tr>
+      <w:tr>
+        <w:tc>
+          <w:tcPr>
+            <w:tcW w:type="dxa" w:w="3408"/>
+          </w:tcPr>
+          <w:p>
+            <w:r>
+              <w:t>Total current assets / current liabilities FY26</w:t>
+            </w:r>
+          </w:p>
+        </w:tc>
+        <w:tc>
+          <w:tcPr>
+            <w:tcW w:type="dxa" w:w="3408"/>
+          </w:tcPr>
+          <w:p>
+            <w:r>
+              <w:t>1.27x</w:t>
+            </w:r>
+          </w:p>
+        </w:tc>
+        <w:tc>
+          <w:tcPr>
+            <w:tcW w:type="dxa" w:w="3408"/>
+          </w:tcPr>
+          <w:p>
+            <w:r>
+              <w:t>Current assets divided by current liabilities; group-wide indicator only</w:t>
+            </w:r>
+          </w:p>
+        </w:tc>
+      </w:tr>
+      <w:tr>
+        <w:tc>
+          <w:tcPr>
+            <w:tcW w:type="dxa" w:w="3408"/>
+          </w:tcPr>
+          <w:p>
+            <w:r>
+              <w:t>Gross borrowings / total equity FY25</w:t>
+            </w:r>
+          </w:p>
+        </w:tc>
+        <w:tc>
+          <w:tcPr>
+            <w:tcW w:type="dxa" w:w="3408"/>
+          </w:tcPr>
+          <w:p>
+            <w:r>
+              <w:t>1.36x</w:t>
+            </w:r>
+          </w:p>
+        </w:tc>
+        <w:tc>
+          <w:tcPr>
+            <w:tcW w:type="dxa" w:w="3408"/>
+          </w:tcPr>
+          <w:p>
+            <w:r>
+              <w:t>Current plus non-current borrowings / total equity including NCI; not an industrial net-debt ratio</w:t>
+            </w:r>
+          </w:p>
+        </w:tc>
+      </w:tr>
+      <w:tr>
+        <w:tc>
+          <w:tcPr>
+            <w:tcW w:type="dxa" w:w="3408"/>
+          </w:tcPr>
+          <w:p>
+            <w:r>
+              <w:t>Gross borrowings / total equity FY26</w:t>
+            </w:r>
+          </w:p>
+        </w:tc>
+        <w:tc>
+          <w:tcPr>
+            <w:tcW w:type="dxa" w:w="3408"/>
+          </w:tcPr>
+          <w:p>
+            <w:r>
+              <w:t>1.18x</w:t>
+            </w:r>
+          </w:p>
+        </w:tc>
+        <w:tc>
+          <w:tcPr>
+            <w:tcW w:type="dxa" w:w="3408"/>
+          </w:tcPr>
+          <w:p>
+            <w:r>
+              <w:t>Current plus non-current borrowings / total equity including NCI; not an industrial net-debt ratio</w:t>
+            </w:r>
+          </w:p>
+        </w:tc>
+      </w:tr>
     </w:tbl>
     <w:p>
       <w:r>
-        <w:t>The CFO-minus-capex metric is not a full standardized free-cash-flow calculation. Consolidated cash-flow statements include financial-services receivables, investment purchases and sales, deposits and other group flows. A manufacturer-only cash conversion ratio would require segment-level detail and consistent working-capital definitions. For the same reason, a generic current ratio or debt/equity figure for this diversified group may mislead if read as a pure automotive metric.</w:t>
+        <w:t>The audited consolidated balance sheet reports total assets of ₹277,586.27 crore at March 2025 and ₹317,634.64 crore at March 2026; total equity including non-controlling interests increased from ₹89,098.00 crore to ₹109,491.00 crore. Total current assets / total current liabilities decreased from 1.40x to 1.27x, while current plus non-current borrowings divided by total equity decreased from approximately 1.36x to 1.18x [F6]. These are broad group ratios only: the group includes a large lending business, whose loans, funding and liquidity profile are fundamentally different from the inventory-and-trade-credit model of a vehicle manufacturer. They should not be interpreted as a standalone automotive working-capital or industrial gearing test.</w:t>
       </w:r>
     </w:p>
     <w:p>
@@ -900,7 +1092,7 @@
     </w:p>
     <w:p>
       <w:r>
-        <w:t>Market-data run timestamp: 2026-10-13T19:33:38+00:00; requested history 5y; observed price range 2021-10-13 to 2026-10-12. Exact tickers and observations are in outputs/run_metadata.json.</w:t>
+        <w:t>Market-data run timestamp: 2026-10-13T19:34:27+00:00; requested history 5y; observed price range 2021-10-13 to 2026-10-12. Exact tickers and observations are in outputs/run_metadata.json.</w:t>
       </w:r>
     </w:p>
     <w:sectPr>

</xml_diff>